<commit_message>
IMS: fix NABH citation, MCI attribution, and non-clickable URLs
- Fixed generic NABH citation across all 7 files to full APA format
- Fixed IMS5 paragraph wrongly attributing the 2002 Code of Medical
  Ethics Regulations to NMC instead of MCI (NMC did not exist in 2002)
- Converted all 7 plain-text NABH citation URLs into real clickable
  hyperlinks (previously just visible text containing a URL, not an
  actual link in Word)
</commit_message>
<xml_diff>
--- a/policies/build/chapters_v2/IMS/Documents/IMS_Package_v2/IMS1/SOP_IMS1_meeting_information_needs.docx
+++ b/policies/build/chapters_v2/IMS/Documents/IMS_Package_v2/IMS1/SOP_IMS1_meeting_information_needs.docx
@@ -925,12 +925,15 @@
       <w:pPr>
         <w:pStyle w:val="ListParagraph"/>
       </w:pPr>
-      <w:r>
-        <w:rPr>
-          <w:i/>
-        </w:rPr>
-        <w:t>NABH — Accreditation Standards for Hospitals, 6th Edition, IMS.1 — named source, no working link could be verified from here; check directly.</w:t>
-      </w:r>
+      <w:hyperlink r:id="rId15">
+        <w:r>
+          <w:rPr>
+            <w:rStyle w:val="Hyperlink"/>
+            <w:i/>
+          </w:rPr>
+          <w:t>National Accreditation Board for Hospitals and Healthcare Providers. (2025). NABH accreditation standards for hospitals (6th ed.), IMS.1. ISBN 978-81-965264-9-8. https://portal.nabh.co/images/Standards/NABH%20Hospital%20Accreditation%20Standard%206th%20Edition%20January%202025.pdf</w:t>
+        </w:r>
+      </w:hyperlink>
     </w:p>
     <w:p>
       <w:pPr>

</xml_diff>